<commit_message>
fix: retain second chapter figure reference
Co-authored-by: McFeel <McFeel@users.noreply.github.com>
</commit_message>
<xml_diff>
--- a/docs/hq-base-framework/deliverables/南网总部基地建设框架方案_2026-08-30_修订3.docx
+++ b/docs/hq-base-framework/deliverables/南网总部基地建设框架方案_2026-08-30_修订3.docx
@@ -1215,6 +1215,15 @@
           <w:sz w:val="22"/>
         </w:rPr>
         <w:t>本章结论是：现有材料足以作出“先诊断、先立账、先规划平台、分区试点”的方向判断，但不足以设定项目量化指标。总部基地是持续运行的既有园区，设备、风貌、停机窗口和数据口径共同决定了不能采用成片停机、先换设备后找成效的路径；缺口不影响框架方向，影响的是目标值、工程量和实施边界，均留待预可研回答。</w:t>
+      </w:r>
+      <w:r>
+        <w:rPr>
+          <w:rFonts w:ascii="宋体" w:hAnsi="宋体" w:eastAsia="宋体"/>
+          <w:b w:val="0"/>
+          <w:color w:val="000000"/>
+          <w:sz w:val="22"/>
+        </w:rPr>
+        <w:t>五项硬约束及其方案含义见图 2-1。</w:t>
       </w:r>
     </w:p>
     <w:p>

</xml_diff>

<commit_message>
fix: remove legacy figure placeholder boxes
Co-authored-by: McFeel <McFeel@users.noreply.github.com>
</commit_message>
<xml_diff>
--- a/docs/hq-base-framework/deliverables/南网总部基地建设框架方案_2026-08-30_修订3.docx
+++ b/docs/hq-base-framework/deliverables/南网总部基地建设框架方案_2026-08-30_修订3.docx
@@ -1099,55 +1099,6 @@
         <w:t>政策束与三层战略收拢关系见图 1-1。</w:t>
       </w:r>
     </w:p>
-    <w:tbl>
-      <w:tblPr>
-        <w:tblStyle w:val="TableGrid"/>
-        <w:tblW w:type="auto" w:w="0"/>
-        <w:jc w:val="center"/>
-        <w:tblLook w:firstColumn="1" w:firstRow="1" w:lastColumn="0" w:lastRow="0" w:noHBand="0" w:noVBand="1" w:val="04A0"/>
-      </w:tblPr>
-      <w:tblGrid>
-        <w:gridCol w:w="8958"/>
-      </w:tblGrid>
-      <w:tr>
-        <w:tc>
-          <w:tcPr>
-            <w:tcW w:type="dxa" w:w="8504"/>
-            <w:shd w:fill="F2F8FA"/>
-          </w:tcPr>
-          <w:p>
-            <w:pPr>
-              <w:ind w:firstLine="0"/>
-              <w:jc w:val="center"/>
-            </w:pPr>
-            <w:r>
-              <w:rPr>
-                <w:rFonts w:ascii="黑体" w:hAnsi="黑体" w:eastAsia="黑体"/>
-                <w:b/>
-                <w:color w:val="006478"/>
-                <w:sz w:val="24"/>
-              </w:rPr>
-              <w:t>F1  政策束与三层战略收拢图</w:t>
-            </w:r>
-          </w:p>
-          <w:p>
-            <w:pPr>
-              <w:ind w:firstLine="0"/>
-              <w:jc w:val="center"/>
-            </w:pPr>
-            <w:r>
-              <w:rPr>
-                <w:rFonts w:ascii="宋体" w:hAnsi="宋体" w:eastAsia="宋体"/>
-                <w:b w:val="0"/>
-                <w:color w:val="464646"/>
-                <w:sz w:val="20"/>
-              </w:rPr>
-              <w:t>【插图占位】展示国家方向、行业与电网、园区与建筑、南网自身四层政策如何支撑改造，并收拢到总部基地第一验证场。</w:t>
-            </w:r>
-          </w:p>
-        </w:tc>
-      </w:tr>
-    </w:tbl>
     <w:p>
       <w:pPr>
         <w:keepLines/>
@@ -1744,64 +1695,6 @@
         <w:spacing w:after="0"/>
       </w:pPr>
     </w:p>
-    <w:tbl>
-      <w:tblPr>
-        <w:tblW w:type="auto" w:w="0"/>
-        <w:jc w:val="center"/>
-        <w:tblLayout w:type="fixed"/>
-        <w:tblLook w:firstColumn="1" w:firstRow="1" w:lastColumn="0" w:lastRow="0" w:noHBand="0" w:noVBand="1" w:val="04A0"/>
-      </w:tblPr>
-      <w:tblGrid>
-        <w:gridCol w:w="8958"/>
-      </w:tblGrid>
-      <w:tr>
-        <w:trPr>
-          <w:cantSplit/>
-        </w:trPr>
-        <w:tc>
-          <w:tcPr>
-            <w:tcW w:type="dxa" w:w="8504"/>
-            <w:shd w:fill="F2F8FA"/>
-            <w:tcMar>
-              <w:top w:w="260" w:type="dxa"/>
-              <w:start w:w="220" w:type="dxa"/>
-              <w:bottom w:w="260" w:type="dxa"/>
-              <w:end w:w="220" w:type="dxa"/>
-            </w:tcMar>
-          </w:tcPr>
-          <w:p>
-            <w:pPr>
-              <w:ind w:firstLine="0"/>
-              <w:jc w:val="center"/>
-            </w:pPr>
-            <w:r>
-              <w:rPr>
-                <w:rFonts w:ascii="黑体" w:hAnsi="黑体" w:eastAsia="黑体"/>
-                <w:b/>
-                <w:color w:val="006478"/>
-                <w:sz w:val="24"/>
-              </w:rPr>
-              <w:t>F4  园区现状与约束一页图</w:t>
-            </w:r>
-          </w:p>
-          <w:p>
-            <w:pPr>
-              <w:ind w:firstLine="0"/>
-              <w:jc w:val="center"/>
-            </w:pPr>
-            <w:r>
-              <w:rPr>
-                <w:rFonts w:ascii="宋体" w:hAnsi="宋体" w:eastAsia="宋体"/>
-                <w:b w:val="0"/>
-                <w:color w:val="464646"/>
-                <w:sz w:val="20"/>
-              </w:rPr>
-              <w:t>【插图占位】以正在运行的既有园区为中心，呈现五项硬约束及“不停机、针灸式、先测后改”的方案选择。</w:t>
-            </w:r>
-          </w:p>
-        </w:tc>
-      </w:tr>
-    </w:tbl>
     <w:p>
       <w:pPr>
         <w:keepLines/>
@@ -2106,64 +1999,6 @@
         <w:t>一核六边总体架构见图 3-1，战略资产四件套与复制路径见图 3-2。</w:t>
       </w:r>
     </w:p>
-    <w:tbl>
-      <w:tblPr>
-        <w:tblW w:type="auto" w:w="0"/>
-        <w:jc w:val="center"/>
-        <w:tblLayout w:type="fixed"/>
-        <w:tblLook w:firstColumn="1" w:firstRow="1" w:lastColumn="0" w:lastRow="0" w:noHBand="0" w:noVBand="1" w:val="04A0"/>
-      </w:tblPr>
-      <w:tblGrid>
-        <w:gridCol w:w="8958"/>
-      </w:tblGrid>
-      <w:tr>
-        <w:trPr>
-          <w:cantSplit/>
-        </w:trPr>
-        <w:tc>
-          <w:tcPr>
-            <w:tcW w:type="dxa" w:w="8504"/>
-            <w:shd w:fill="F2F8FA"/>
-            <w:tcMar>
-              <w:top w:w="260" w:type="dxa"/>
-              <w:start w:w="220" w:type="dxa"/>
-              <w:bottom w:w="260" w:type="dxa"/>
-              <w:end w:w="220" w:type="dxa"/>
-            </w:tcMar>
-          </w:tcPr>
-          <w:p>
-            <w:pPr>
-              <w:ind w:firstLine="0"/>
-              <w:jc w:val="center"/>
-            </w:pPr>
-            <w:r>
-              <w:rPr>
-                <w:rFonts w:ascii="黑体" w:hAnsi="黑体" w:eastAsia="黑体"/>
-                <w:b/>
-                <w:color w:val="006478"/>
-                <w:sz w:val="24"/>
-              </w:rPr>
-              <w:t>F2  一核六边总图</w:t>
-            </w:r>
-          </w:p>
-          <w:p>
-            <w:pPr>
-              <w:ind w:firstLine="0"/>
-              <w:jc w:val="center"/>
-            </w:pPr>
-            <w:r>
-              <w:rPr>
-                <w:rFonts w:ascii="宋体" w:hAnsi="宋体" w:eastAsia="宋体"/>
-                <w:b w:val="0"/>
-                <w:color w:val="464646"/>
-                <w:sz w:val="20"/>
-              </w:rPr>
-              <w:t>【插图占位】核心为“加快积累战略资产、驱动第二增长曲线”，六边独立展开并向核沉淀资产。</w:t>
-            </w:r>
-          </w:p>
-        </w:tc>
-      </w:tr>
-    </w:tbl>
     <w:p>
       <w:pPr>
         <w:keepLines/>
@@ -2216,64 +2051,6 @@
         <w:t>图 3-1 一核六边总图</w:t>
       </w:r>
     </w:p>
-    <w:tbl>
-      <w:tblPr>
-        <w:tblW w:type="auto" w:w="0"/>
-        <w:jc w:val="center"/>
-        <w:tblLayout w:type="fixed"/>
-        <w:tblLook w:firstColumn="1" w:firstRow="1" w:lastColumn="0" w:lastRow="0" w:noHBand="0" w:noVBand="1" w:val="04A0"/>
-      </w:tblPr>
-      <w:tblGrid>
-        <w:gridCol w:w="8958"/>
-      </w:tblGrid>
-      <w:tr>
-        <w:trPr>
-          <w:cantSplit/>
-        </w:trPr>
-        <w:tc>
-          <w:tcPr>
-            <w:tcW w:type="dxa" w:w="8504"/>
-            <w:shd w:fill="F2F8FA"/>
-            <w:tcMar>
-              <w:top w:w="260" w:type="dxa"/>
-              <w:start w:w="220" w:type="dxa"/>
-              <w:bottom w:w="260" w:type="dxa"/>
-              <w:end w:w="220" w:type="dxa"/>
-            </w:tcMar>
-          </w:tcPr>
-          <w:p>
-            <w:pPr>
-              <w:ind w:firstLine="0"/>
-              <w:jc w:val="center"/>
-            </w:pPr>
-            <w:r>
-              <w:rPr>
-                <w:rFonts w:ascii="黑体" w:hAnsi="黑体" w:eastAsia="黑体"/>
-                <w:b/>
-                <w:color w:val="006478"/>
-                <w:sz w:val="24"/>
-              </w:rPr>
-              <w:t>F3  战略资产四件套与“内部验证—行业复制”路径图</w:t>
-            </w:r>
-          </w:p>
-          <w:p>
-            <w:pPr>
-              <w:ind w:firstLine="0"/>
-              <w:jc w:val="center"/>
-            </w:pPr>
-            <w:r>
-              <w:rPr>
-                <w:rFonts w:ascii="宋体" w:hAnsi="宋体" w:eastAsia="宋体"/>
-                <w:b w:val="0"/>
-                <w:color w:val="464646"/>
-                <w:sz w:val="20"/>
-              </w:rPr>
-              <w:t>【插图占位】展示四类战略资产从总部基地内部验证，依次走向南网内复制和行业复制。</w:t>
-            </w:r>
-          </w:p>
-        </w:tc>
-      </w:tr>
-    </w:tbl>
     <w:p>
       <w:pPr>
         <w:keepLines/>
@@ -3965,64 +3742,6 @@
         <w:t>目标档位与核算边界的前后关系见图 4-1。</w:t>
       </w:r>
     </w:p>
-    <w:tbl>
-      <w:tblPr>
-        <w:tblW w:type="auto" w:w="0"/>
-        <w:jc w:val="center"/>
-        <w:tblLayout w:type="fixed"/>
-        <w:tblLook w:firstColumn="1" w:firstRow="1" w:lastColumn="0" w:lastRow="0" w:noHBand="0" w:noVBand="1" w:val="04A0"/>
-      </w:tblPr>
-      <w:tblGrid>
-        <w:gridCol w:w="8958"/>
-      </w:tblGrid>
-      <w:tr>
-        <w:trPr>
-          <w:cantSplit/>
-        </w:trPr>
-        <w:tc>
-          <w:tcPr>
-            <w:tcW w:type="dxa" w:w="8504"/>
-            <w:shd w:fill="F2F8FA"/>
-            <w:tcMar>
-              <w:top w:w="260" w:type="dxa"/>
-              <w:start w:w="220" w:type="dxa"/>
-              <w:bottom w:w="260" w:type="dxa"/>
-              <w:end w:w="220" w:type="dxa"/>
-            </w:tcMar>
-          </w:tcPr>
-          <w:p>
-            <w:pPr>
-              <w:ind w:firstLine="0"/>
-              <w:jc w:val="center"/>
-            </w:pPr>
-            <w:r>
-              <w:rPr>
-                <w:rFonts w:ascii="黑体" w:hAnsi="黑体" w:eastAsia="黑体"/>
-                <w:b/>
-                <w:color w:val="006478"/>
-                <w:sz w:val="24"/>
-              </w:rPr>
-              <w:t>F5  目标三档台阶与边界关系图</w:t>
-            </w:r>
-          </w:p>
-          <w:p>
-            <w:pPr>
-              <w:ind w:firstLine="0"/>
-              <w:jc w:val="center"/>
-            </w:pPr>
-            <w:r>
-              <w:rPr>
-                <w:rFonts w:ascii="宋体" w:hAnsi="宋体" w:eastAsia="宋体"/>
-                <w:b w:val="0"/>
-                <w:color w:val="464646"/>
-                <w:sz w:val="20"/>
-              </w:rPr>
-              <w:t>【插图占位】上部并列低碳、近零碳、碳中和三档，下部比较机房入账与独立核算，突出“先边界、再目标”。</w:t>
-            </w:r>
-          </w:p>
-        </w:tc>
-      </w:tr>
-    </w:tbl>
     <w:p>
       <w:pPr>
         <w:keepLines/>
@@ -4101,64 +3820,6 @@
         <w:t>六边技术族、首批动作及资产沉淀关系见图 5-1。</w:t>
       </w:r>
     </w:p>
-    <w:tbl>
-      <w:tblPr>
-        <w:tblW w:type="auto" w:w="0"/>
-        <w:jc w:val="center"/>
-        <w:tblLayout w:type="fixed"/>
-        <w:tblLook w:firstColumn="1" w:firstRow="1" w:lastColumn="0" w:lastRow="0" w:noHBand="0" w:noVBand="1" w:val="04A0"/>
-      </w:tblPr>
-      <w:tblGrid>
-        <w:gridCol w:w="8958"/>
-      </w:tblGrid>
-      <w:tr>
-        <w:trPr>
-          <w:cantSplit/>
-        </w:trPr>
-        <w:tc>
-          <w:tcPr>
-            <w:tcW w:type="dxa" w:w="8504"/>
-            <w:shd w:fill="F2F8FA"/>
-            <w:tcMar>
-              <w:top w:w="260" w:type="dxa"/>
-              <w:start w:w="220" w:type="dxa"/>
-              <w:bottom w:w="260" w:type="dxa"/>
-              <w:end w:w="220" w:type="dxa"/>
-            </w:tcMar>
-          </w:tcPr>
-          <w:p>
-            <w:pPr>
-              <w:ind w:firstLine="0"/>
-              <w:jc w:val="center"/>
-            </w:pPr>
-            <w:r>
-              <w:rPr>
-                <w:rFonts w:ascii="黑体" w:hAnsi="黑体" w:eastAsia="黑体"/>
-                <w:b/>
-                <w:color w:val="006478"/>
-                <w:sz w:val="24"/>
-              </w:rPr>
-              <w:t>F6  六边×技术族矩阵总表</w:t>
-            </w:r>
-          </w:p>
-          <w:p>
-            <w:pPr>
-              <w:ind w:firstLine="0"/>
-              <w:jc w:val="center"/>
-            </w:pPr>
-            <w:r>
-              <w:rPr>
-                <w:rFonts w:ascii="宋体" w:hAnsi="宋体" w:eastAsia="宋体"/>
-                <w:b w:val="0"/>
-                <w:color w:val="464646"/>
-                <w:sz w:val="20"/>
-              </w:rPr>
-              <w:t>【插图占位】按六边列示定义、硬技术族、首批动作和向核沉淀资产，作为本章行动导览。</w:t>
-            </w:r>
-          </w:p>
-        </w:tc>
-      </w:tr>
-    </w:tbl>
     <w:p>
       <w:pPr>
         <w:keepLines/>
@@ -4442,64 +4103,6 @@
         <w:t>柔性资源与实时电价的对接路线见图 5-2。</w:t>
       </w:r>
     </w:p>
-    <w:tbl>
-      <w:tblPr>
-        <w:tblW w:type="auto" w:w="0"/>
-        <w:jc w:val="center"/>
-        <w:tblLayout w:type="fixed"/>
-        <w:tblLook w:firstColumn="1" w:firstRow="1" w:lastColumn="0" w:lastRow="0" w:noHBand="0" w:noVBand="1" w:val="04A0"/>
-      </w:tblPr>
-      <w:tblGrid>
-        <w:gridCol w:w="8958"/>
-      </w:tblGrid>
-      <w:tr>
-        <w:trPr>
-          <w:cantSplit/>
-        </w:trPr>
-        <w:tc>
-          <w:tcPr>
-            <w:tcW w:type="dxa" w:w="8504"/>
-            <w:shd w:fill="F2F8FA"/>
-            <w:tcMar>
-              <w:top w:w="260" w:type="dxa"/>
-              <w:start w:w="220" w:type="dxa"/>
-              <w:bottom w:w="260" w:type="dxa"/>
-              <w:end w:w="220" w:type="dxa"/>
-            </w:tcMar>
-          </w:tcPr>
-          <w:p>
-            <w:pPr>
-              <w:ind w:firstLine="0"/>
-              <w:jc w:val="center"/>
-            </w:pPr>
-            <w:r>
-              <w:rPr>
-                <w:rFonts w:ascii="黑体" w:hAnsi="黑体" w:eastAsia="黑体"/>
-                <w:b/>
-                <w:color w:val="006478"/>
-                <w:sz w:val="24"/>
-              </w:rPr>
-              <w:t>F9  柔性资源—实时电价对接技术路线图</w:t>
-            </w:r>
-          </w:p>
-          <w:p>
-            <w:pPr>
-              <w:ind w:firstLine="0"/>
-              <w:jc w:val="center"/>
-            </w:pPr>
-            <w:r>
-              <w:rPr>
-                <w:rFonts w:ascii="宋体" w:hAnsi="宋体" w:eastAsia="宋体"/>
-                <w:b w:val="0"/>
-                <w:color w:val="464646"/>
-                <w:sz w:val="20"/>
-              </w:rPr>
-              <w:t>【插图占位】对比固定低谷控制与实时电价下的预测调度，展示蓄冷、光伏、储能和充电资源聚合路径。</w:t>
-            </w:r>
-          </w:p>
-        </w:tc>
-      </w:tr>
-    </w:tbl>
     <w:p>
       <w:pPr>
         <w:keepLines/>
@@ -4672,64 +4275,6 @@
         <w:t>“一个平台、两类功能”的完整架构见图 5-3。</w:t>
       </w:r>
     </w:p>
-    <w:tbl>
-      <w:tblPr>
-        <w:tblW w:type="auto" w:w="0"/>
-        <w:jc w:val="center"/>
-        <w:tblLayout w:type="fixed"/>
-        <w:tblLook w:firstColumn="1" w:firstRow="1" w:lastColumn="0" w:lastRow="0" w:noHBand="0" w:noVBand="1" w:val="04A0"/>
-      </w:tblPr>
-      <w:tblGrid>
-        <w:gridCol w:w="8958"/>
-      </w:tblGrid>
-      <w:tr>
-        <w:trPr>
-          <w:cantSplit/>
-        </w:trPr>
-        <w:tc>
-          <w:tcPr>
-            <w:tcW w:type="dxa" w:w="8504"/>
-            <w:shd w:fill="F2F8FA"/>
-            <w:tcMar>
-              <w:top w:w="260" w:type="dxa"/>
-              <w:start w:w="220" w:type="dxa"/>
-              <w:bottom w:w="260" w:type="dxa"/>
-              <w:end w:w="220" w:type="dxa"/>
-            </w:tcMar>
-          </w:tcPr>
-          <w:p>
-            <w:pPr>
-              <w:ind w:firstLine="0"/>
-              <w:jc w:val="center"/>
-            </w:pPr>
-            <w:r>
-              <w:rPr>
-                <w:rFonts w:ascii="黑体" w:hAnsi="黑体" w:eastAsia="黑体"/>
-                <w:b/>
-                <w:color w:val="006478"/>
-                <w:sz w:val="24"/>
-              </w:rPr>
-              <w:t>F7  “一个平台、两类功能”智慧架构图</w:t>
-            </w:r>
-          </w:p>
-          <w:p>
-            <w:pPr>
-              <w:ind w:firstLine="0"/>
-              <w:jc w:val="center"/>
-            </w:pPr>
-            <w:r>
-              <w:rPr>
-                <w:rFonts w:ascii="宋体" w:hAnsi="宋体" w:eastAsia="宋体"/>
-                <w:b w:val="0"/>
-                <w:color w:val="464646"/>
-                <w:sz w:val="20"/>
-              </w:rPr>
-              <w:t>【插图占位】以感知计量、统一平台和园内/园外两翼构成架构，突出数据主权与南网电网交易接口。</w:t>
-            </w:r>
-          </w:p>
-        </w:tc>
-      </w:tr>
-    </w:tbl>
     <w:p>
       <w:pPr>
         <w:keepLines/>
@@ -4868,64 +4413,6 @@
         <w:t>普惠三环及其共同底线见图 5-4。</w:t>
       </w:r>
     </w:p>
-    <w:tbl>
-      <w:tblPr>
-        <w:tblW w:type="auto" w:w="0"/>
-        <w:jc w:val="center"/>
-        <w:tblLayout w:type="fixed"/>
-        <w:tblLook w:firstColumn="1" w:firstRow="1" w:lastColumn="0" w:lastRow="0" w:noHBand="0" w:noVBand="1" w:val="04A0"/>
-      </w:tblPr>
-      <w:tblGrid>
-        <w:gridCol w:w="8958"/>
-      </w:tblGrid>
-      <w:tr>
-        <w:trPr>
-          <w:cantSplit/>
-        </w:trPr>
-        <w:tc>
-          <w:tcPr>
-            <w:tcW w:type="dxa" w:w="8504"/>
-            <w:shd w:fill="F2F8FA"/>
-            <w:tcMar>
-              <w:top w:w="260" w:type="dxa"/>
-              <w:start w:w="220" w:type="dxa"/>
-              <w:bottom w:w="260" w:type="dxa"/>
-              <w:end w:w="220" w:type="dxa"/>
-            </w:tcMar>
-          </w:tcPr>
-          <w:p>
-            <w:pPr>
-              <w:ind w:firstLine="0"/>
-              <w:jc w:val="center"/>
-            </w:pPr>
-            <w:r>
-              <w:rPr>
-                <w:rFonts w:ascii="黑体" w:hAnsi="黑体" w:eastAsia="黑体"/>
-                <w:b/>
-                <w:color w:val="006478"/>
-                <w:sz w:val="24"/>
-              </w:rPr>
-              <w:t>F10  普惠“人人参与、人人受益”三环图</w:t>
-            </w:r>
-          </w:p>
-          <w:p>
-            <w:pPr>
-              <w:ind w:firstLine="0"/>
-              <w:jc w:val="center"/>
-            </w:pPr>
-            <w:r>
-              <w:rPr>
-                <w:rFonts w:ascii="宋体" w:hAnsi="宋体" w:eastAsia="宋体"/>
-                <w:b w:val="0"/>
-                <w:color w:val="464646"/>
-                <w:sz w:val="20"/>
-              </w:rPr>
-              <w:t>【插图占位】以碳普惠、算力普惠、园区资源普惠构成闭环，无障碍与适老化作为共同底线。</w:t>
-            </w:r>
-          </w:p>
-        </w:tc>
-      </w:tr>
-    </w:tbl>
     <w:p>
       <w:pPr>
         <w:keepLines/>
@@ -5254,64 +4741,6 @@
         <w:t>七项信息港做法、总部基地落点及差异化见图 6-1。</w:t>
       </w:r>
     </w:p>
-    <w:tbl>
-      <w:tblPr>
-        <w:tblW w:type="auto" w:w="0"/>
-        <w:jc w:val="center"/>
-        <w:tblLayout w:type="fixed"/>
-        <w:tblLook w:firstColumn="1" w:firstRow="1" w:lastColumn="0" w:lastRow="0" w:noHBand="0" w:noVBand="1" w:val="04A0"/>
-      </w:tblPr>
-      <w:tblGrid>
-        <w:gridCol w:w="8958"/>
-      </w:tblGrid>
-      <w:tr>
-        <w:trPr>
-          <w:cantSplit/>
-        </w:trPr>
-        <w:tc>
-          <w:tcPr>
-            <w:tcW w:type="dxa" w:w="8504"/>
-            <w:shd w:fill="F2F8FA"/>
-            <w:tcMar>
-              <w:top w:w="260" w:type="dxa"/>
-              <w:start w:w="220" w:type="dxa"/>
-              <w:bottom w:w="260" w:type="dxa"/>
-              <w:end w:w="220" w:type="dxa"/>
-            </w:tcMar>
-          </w:tcPr>
-          <w:p>
-            <w:pPr>
-              <w:ind w:firstLine="0"/>
-              <w:jc w:val="center"/>
-            </w:pPr>
-            <w:r>
-              <w:rPr>
-                <w:rFonts w:ascii="黑体" w:hAnsi="黑体" w:eastAsia="黑体"/>
-                <w:b/>
-                <w:color w:val="006478"/>
-                <w:sz w:val="24"/>
-              </w:rPr>
-              <w:t>F8  信息港做法→总部基地落点映射对照表</w:t>
-            </w:r>
-          </w:p>
-          <w:p>
-            <w:pPr>
-              <w:ind w:firstLine="0"/>
-              <w:jc w:val="center"/>
-            </w:pPr>
-            <w:r>
-              <w:rPr>
-                <w:rFonts w:ascii="宋体" w:hAnsi="宋体" w:eastAsia="宋体"/>
-                <w:b w:val="0"/>
-                <w:color w:val="464646"/>
-                <w:sz w:val="20"/>
-              </w:rPr>
-              <w:t>【插图占位】逐项呈现信息港公开做法、总部基地可落场景及南网在电网互动、交易和数据主权上的差异。</w:t>
-            </w:r>
-          </w:p>
-        </w:tc>
-      </w:tr>
-    </w:tbl>
     <w:p>
       <w:pPr>
         <w:keepLines/>
@@ -6247,64 +5676,6 @@
         <w:t>三件先行、决策节点与实施节奏见图 7-1。</w:t>
       </w:r>
     </w:p>
-    <w:tbl>
-      <w:tblPr>
-        <w:tblW w:type="auto" w:w="0"/>
-        <w:jc w:val="center"/>
-        <w:tblLayout w:type="fixed"/>
-        <w:tblLook w:firstColumn="1" w:firstRow="1" w:lastColumn="0" w:lastRow="0" w:noHBand="0" w:noVBand="1" w:val="04A0"/>
-      </w:tblPr>
-      <w:tblGrid>
-        <w:gridCol w:w="8958"/>
-      </w:tblGrid>
-      <w:tr>
-        <w:trPr>
-          <w:cantSplit/>
-        </w:trPr>
-        <w:tc>
-          <w:tcPr>
-            <w:tcW w:type="dxa" w:w="8504"/>
-            <w:shd w:fill="F2F8FA"/>
-            <w:tcMar>
-              <w:top w:w="260" w:type="dxa"/>
-              <w:start w:w="220" w:type="dxa"/>
-              <w:bottom w:w="260" w:type="dxa"/>
-              <w:end w:w="220" w:type="dxa"/>
-            </w:tcMar>
-          </w:tcPr>
-          <w:p>
-            <w:pPr>
-              <w:ind w:firstLine="0"/>
-              <w:jc w:val="center"/>
-            </w:pPr>
-            <w:r>
-              <w:rPr>
-                <w:rFonts w:ascii="黑体" w:hAnsi="黑体" w:eastAsia="黑体"/>
-                <w:b/>
-                <w:color w:val="006478"/>
-                <w:sz w:val="24"/>
-              </w:rPr>
-              <w:t>F11  实施路线图（时间轴）</w:t>
-            </w:r>
-          </w:p>
-          <w:p>
-            <w:pPr>
-              <w:ind w:firstLine="0"/>
-              <w:jc w:val="center"/>
-            </w:pPr>
-            <w:r>
-              <w:rPr>
-                <w:rFonts w:ascii="宋体" w:hAnsi="宋体" w:eastAsia="宋体"/>
-                <w:b w:val="0"/>
-                <w:color w:val="464646"/>
-                <w:sz w:val="20"/>
-              </w:rPr>
-              <w:t>【插图占位】贯通 9 月方向性汇报、10 月前预可研、分阶段预算和园中园试点，并展示三件先行的并行关系。</w:t>
-            </w:r>
-          </w:p>
-        </w:tc>
-      </w:tr>
-    </w:tbl>
     <w:p>
       <w:pPr>
         <w:keepLines/>
@@ -7076,64 +6447,6 @@
         <w:t>证据使用规则与全量待核事项见图 A-1。</w:t>
       </w:r>
     </w:p>
-    <w:tbl>
-      <w:tblPr>
-        <w:tblW w:type="auto" w:w="0"/>
-        <w:jc w:val="center"/>
-        <w:tblLayout w:type="fixed"/>
-        <w:tblLook w:firstColumn="1" w:firstRow="1" w:lastColumn="0" w:lastRow="0" w:noHBand="0" w:noVBand="1" w:val="04A0"/>
-      </w:tblPr>
-      <w:tblGrid>
-        <w:gridCol w:w="8958"/>
-      </w:tblGrid>
-      <w:tr>
-        <w:trPr>
-          <w:cantSplit/>
-        </w:trPr>
-        <w:tc>
-          <w:tcPr>
-            <w:tcW w:type="dxa" w:w="8504"/>
-            <w:shd w:fill="F2F8FA"/>
-            <w:tcMar>
-              <w:top w:w="260" w:type="dxa"/>
-              <w:start w:w="220" w:type="dxa"/>
-              <w:bottom w:w="260" w:type="dxa"/>
-              <w:end w:w="220" w:type="dxa"/>
-            </w:tcMar>
-          </w:tcPr>
-          <w:p>
-            <w:pPr>
-              <w:ind w:firstLine="0"/>
-              <w:jc w:val="center"/>
-            </w:pPr>
-            <w:r>
-              <w:rPr>
-                <w:rFonts w:ascii="黑体" w:hAnsi="黑体" w:eastAsia="黑体"/>
-                <w:b/>
-                <w:color w:val="006478"/>
-                <w:sz w:val="24"/>
-              </w:rPr>
-              <w:t>F12  证据等级与待核清单表</w:t>
-            </w:r>
-          </w:p>
-          <w:p>
-            <w:pPr>
-              <w:ind w:firstLine="0"/>
-              <w:jc w:val="center"/>
-            </w:pPr>
-            <w:r>
-              <w:rPr>
-                <w:rFonts w:ascii="宋体" w:hAnsi="宋体" w:eastAsia="宋体"/>
-                <w:b w:val="0"/>
-                <w:color w:val="464646"/>
-                <w:sz w:val="20"/>
-              </w:rPr>
-              <w:t>【插图占位】上表呈现 A—E 五级使用规则，下表列示进入预可研前必须核掉的八项事项。</w:t>
-            </w:r>
-          </w:p>
-        </w:tc>
-      </w:tr>
-    </w:tbl>
     <w:p>
       <w:pPr>
         <w:keepLines/>

</xml_diff>